<commit_message>
Makale taslağı: Nuri AKSOY ikinci yazar olarak eklendi
Co-Authored-By: Claude Opus 5.5 <noreply@anthropic.com>
Claude-Session: https://claude.ai/code/session_015jAXZDCpEfHe1YS9ncBut6
</commit_message>
<xml_diff>
--- a/mecelle/makale/mecelle-makale-taslak.docx
+++ b/mecelle/makale/mecelle-makale-taslak.docx
@@ -29,12 +29,43 @@
         </w:rPr>
         <w:t xml:space="preserve">İbrahim GÜNEY</w:t>
       </w:r>
-    </w:p>
-    <w:p>
-      <w:pPr>
-        <w:spacing w:after="60"/>
+      <w:r>
+        <w:rPr>
+          <w:sz w:val="24"/>
+          <w:szCs w:val="24"/>
+          <w:vertAlign w:val="superscript"/>
+        </w:rPr>
+        <w:t xml:space="preserve">1,*</w:t>
+      </w:r>
+      <w:r>
+        <w:rPr>
+          <w:sz w:val="24"/>
+          <w:szCs w:val="24"/>
+        </w:rPr>
+        <w:t xml:space="preserve">  and  Nuri AKSOY</w:t>
+      </w:r>
+      <w:r>
+        <w:rPr>
+          <w:sz w:val="24"/>
+          <w:szCs w:val="24"/>
+          <w:vertAlign w:val="superscript"/>
+        </w:rPr>
+        <w:t xml:space="preserve">2</w:t>
+      </w:r>
+    </w:p>
+    <w:p>
+      <w:pPr>
+        <w:spacing w:after="0"/>
         <w:jc w:val="center"/>
       </w:pPr>
+      <w:r>
+        <w:rPr>
+          <w:sz w:val="20"/>
+          <w:szCs w:val="20"/>
+          <w:vertAlign w:val="superscript"/>
+        </w:rPr>
+        <w:t xml:space="preserve">1</w:t>
+      </w:r>
       <w:r>
         <w:rPr>
           <w:i/>
@@ -42,7 +73,30 @@
           <w:sz w:val="22"/>
           <w:szCs w:val="22"/>
         </w:rPr>
-        <w:t xml:space="preserve">[Affiliation]</w:t>
+        <w:t xml:space="preserve"> [Affiliation]</w:t>
+      </w:r>
+    </w:p>
+    <w:p>
+      <w:pPr>
+        <w:spacing w:after="60"/>
+        <w:jc w:val="center"/>
+      </w:pPr>
+      <w:r>
+        <w:rPr>
+          <w:sz w:val="20"/>
+          <w:szCs w:val="20"/>
+          <w:vertAlign w:val="superscript"/>
+        </w:rPr>
+        <w:t xml:space="preserve">2</w:t>
+      </w:r>
+      <w:r>
+        <w:rPr>
+          <w:i/>
+          <w:iCs/>
+          <w:sz w:val="22"/>
+          <w:szCs w:val="22"/>
+        </w:rPr>
+        <w:t xml:space="preserve"> [Affiliation]</w:t>
       </w:r>
     </w:p>
     <w:p>
@@ -52,10 +106,18 @@
       </w:pPr>
       <w:r>
         <w:rPr>
+          <w:sz w:val="20"/>
+          <w:szCs w:val="20"/>
+          <w:vertAlign w:val="superscript"/>
+        </w:rPr>
+        <w:t xml:space="preserve">*</w:t>
+      </w:r>
+      <w:r>
+        <w:rPr>
           <w:sz w:val="22"/>
           <w:szCs w:val="22"/>
         </w:rPr>
-        <w:t xml:space="preserve">ibrahimguney16@gmail.com</w:t>
+        <w:t xml:space="preserve"> Corresponding author: ibrahimguney16@gmail.com</w:t>
       </w:r>
     </w:p>
     <w:p>

</xml_diff>